<commit_message>
Epic G scoped: Transamerica portfolio assessment + event-overlay design; FRED key wired (.env)
Co-Authored-By: Claude Fable 5 <noreply@anthropic.com>
</commit_message>
<xml_diff>
--- a/ENHANCEMENTS.docx
+++ b/ENHANCEMENTS.docx
@@ -333,6 +333,210 @@
                 <w:szCs w:val="20"/>
               </w:rPr>
               <w:t xml:space="preserve">Notes</w:t>
+            </w:r>
+          </w:p>
+        </w:tc>
+      </w:tr>
+      <w:tr>
+        <w:tc>
+          <w:tcPr>
+            <w:tcW w:type="dxa" w:w="3744"/>
+            <w:tcMar>
+              <w:top w:type="dxa" w:w="60"/>
+              <w:left w:type="dxa" w:w="100"/>
+              <w:bottom w:type="dxa" w:w="60"/>
+              <w:right w:type="dxa" w:w="100"/>
+            </w:tcMar>
+          </w:tcPr>
+          <w:p>
+            <w:r>
+              <w:rPr>
+                <w:b w:val="false"/>
+                <w:bCs w:val="false"/>
+                <w:sz w:val="20"/>
+                <w:szCs w:val="20"/>
+              </w:rPr>
+              <w:t xml:space="preserve">Portfolio assessment &amp; optimization for the user's two Transamerica Retirement accounts</w:t>
+            </w:r>
+          </w:p>
+        </w:tc>
+        <w:tc>
+          <w:tcPr>
+            <w:tcW w:type="dxa" w:w="1310"/>
+            <w:tcMar>
+              <w:top w:type="dxa" w:w="60"/>
+              <w:left w:type="dxa" w:w="100"/>
+              <w:bottom w:type="dxa" w:w="60"/>
+              <w:right w:type="dxa" w:w="100"/>
+            </w:tcMar>
+          </w:tcPr>
+          <w:p>
+            <w:r>
+              <w:rPr>
+                <w:b w:val="false"/>
+                <w:bCs w:val="false"/>
+                <w:sz w:val="20"/>
+                <w:szCs w:val="20"/>
+              </w:rPr>
+              <w:t xml:space="preserve">2026-08-03</w:t>
+            </w:r>
+          </w:p>
+        </w:tc>
+        <w:tc>
+          <w:tcPr>
+            <w:tcW w:type="dxa" w:w="4306"/>
+            <w:tcMar>
+              <w:top w:type="dxa" w:w="60"/>
+              <w:left w:type="dxa" w:w="100"/>
+              <w:bottom w:type="dxa" w:w="60"/>
+              <w:right w:type="dxa" w:w="100"/>
+            </w:tcMar>
+          </w:tcPr>
+          <w:p>
+            <w:r>
+              <w:rPr>
+                <w:b w:val="false"/>
+                <w:bCs w:val="false"/>
+                <w:sz w:val="20"/>
+                <w:szCs w:val="20"/>
+              </w:rPr>
+              <w:t xml:space="preserve">ACCEPTED INTO PLAN (new Epic G): ingest holdings + each plan's fund menu, score held funds and menu alternatives on the foundational criteria, suggest within-menu optimization swaps. User decision: manual entry + CSV import.</w:t>
+            </w:r>
+          </w:p>
+        </w:tc>
+      </w:tr>
+      <w:tr>
+        <w:tc>
+          <w:tcPr>
+            <w:tcW w:type="dxa" w:w="3744"/>
+            <w:tcMar>
+              <w:top w:type="dxa" w:w="60"/>
+              <w:left w:type="dxa" w:w="100"/>
+              <w:bottom w:type="dxa" w:w="60"/>
+              <w:right w:type="dxa" w:w="100"/>
+            </w:tcMar>
+          </w:tcPr>
+          <w:p>
+            <w:r>
+              <w:rPr>
+                <w:b w:val="false"/>
+                <w:bCs w:val="false"/>
+                <w:sz w:val="20"/>
+                <w:szCs w:val="20"/>
+              </w:rPr>
+              <w:t xml:space="preserve">Aggregator sync for account holdings (Plaid / SnapTrade)</w:t>
+            </w:r>
+          </w:p>
+        </w:tc>
+        <w:tc>
+          <w:tcPr>
+            <w:tcW w:type="dxa" w:w="1310"/>
+            <w:tcMar>
+              <w:top w:type="dxa" w:w="60"/>
+              <w:left w:type="dxa" w:w="100"/>
+              <w:bottom w:type="dxa" w:w="60"/>
+              <w:right w:type="dxa" w:w="100"/>
+            </w:tcMar>
+          </w:tcPr>
+          <w:p>
+            <w:r>
+              <w:rPr>
+                <w:b w:val="false"/>
+                <w:bCs w:val="false"/>
+                <w:sz w:val="20"/>
+                <w:szCs w:val="20"/>
+              </w:rPr>
+              <w:t xml:space="preserve">2026-08-03</w:t>
+            </w:r>
+          </w:p>
+        </w:tc>
+        <w:tc>
+          <w:tcPr>
+            <w:tcW w:type="dxa" w:w="4306"/>
+            <w:tcMar>
+              <w:top w:type="dxa" w:w="60"/>
+              <w:left w:type="dxa" w:w="100"/>
+              <w:bottom w:type="dxa" w:w="60"/>
+              <w:right w:type="dxa" w:w="100"/>
+            </w:tcMar>
+          </w:tcPr>
+          <w:p>
+            <w:r>
+              <w:rPr>
+                <w:b w:val="false"/>
+                <w:bCs w:val="false"/>
+                <w:sz w:val="20"/>
+                <w:szCs w:val="20"/>
+              </w:rPr>
+              <w:t xml:space="preserve">Deferred alternative to manual entry: cost, third-party credential sharing, and spotty Transamerica retirement coverage. Revisit if manual updates become a chore.</w:t>
+            </w:r>
+          </w:p>
+        </w:tc>
+      </w:tr>
+      <w:tr>
+        <w:tc>
+          <w:tcPr>
+            <w:tcW w:type="dxa" w:w="3744"/>
+            <w:tcMar>
+              <w:top w:type="dxa" w:w="60"/>
+              <w:left w:type="dxa" w:w="100"/>
+              <w:bottom w:type="dxa" w:w="60"/>
+              <w:right w:type="dxa" w:w="100"/>
+            </w:tcMar>
+          </w:tcPr>
+          <w:p>
+            <w:r>
+              <w:rPr>
+                <w:b w:val="false"/>
+                <w:bCs w:val="false"/>
+                <w:sz w:val="20"/>
+                <w:szCs w:val="20"/>
+              </w:rPr>
+              <w:t xml:space="preserve">News/current-events influence in assessments (political + business), explicitly called out</w:t>
+            </w:r>
+          </w:p>
+        </w:tc>
+        <w:tc>
+          <w:tcPr>
+            <w:tcW w:type="dxa" w:w="1310"/>
+            <w:tcMar>
+              <w:top w:type="dxa" w:w="60"/>
+              <w:left w:type="dxa" w:w="100"/>
+              <w:bottom w:type="dxa" w:w="60"/>
+              <w:right w:type="dxa" w:w="100"/>
+            </w:tcMar>
+          </w:tcPr>
+          <w:p>
+            <w:r>
+              <w:rPr>
+                <w:b w:val="false"/>
+                <w:bCs w:val="false"/>
+                <w:sz w:val="20"/>
+                <w:szCs w:val="20"/>
+              </w:rPr>
+              <w:t xml:space="preserve">2026-08-03</w:t>
+            </w:r>
+          </w:p>
+        </w:tc>
+        <w:tc>
+          <w:tcPr>
+            <w:tcW w:type="dxa" w:w="4306"/>
+            <w:tcMar>
+              <w:top w:type="dxa" w:w="60"/>
+              <w:left w:type="dxa" w:w="100"/>
+              <w:bottom w:type="dxa" w:w="60"/>
+              <w:right w:type="dxa" w:w="100"/>
+            </w:tcMar>
+          </w:tcPr>
+          <w:p>
+            <w:r>
+              <w:rPr>
+                <w:b w:val="false"/>
+                <w:bCs w:val="false"/>
+                <w:sz w:val="20"/>
+                <w:szCs w:val="20"/>
+              </w:rPr>
+              <w:t xml:space="preserve">ACCEPTED INTO PLAN: two-layer assessment — deterministic factor scores + an event overlay in which every cited news item states its direction of influence. Pulls the LLM narrative layer (E3) earlier; requires Claude API key.</w:t>
             </w:r>
           </w:p>
         </w:tc>

</xml_diff>

<commit_message>
docs: log watchlist symbol-search enhancement as implemented
</commit_message>
<xml_diff>
--- a/ENHANCEMENTS.docx
+++ b/ENHANCEMENTS.docx
@@ -43,7 +43,7 @@
           <w:sz w:val="20"/>
           <w:szCs w:val="20"/>
         </w:rPr>
-        <w:t xml:space="preserve">Last updated: 2026-08-04</w:t>
+        <w:t xml:space="preserve">Last updated: 2026-08-05</w:t>
       </w:r>
     </w:p>
     <w:p>
@@ -182,7 +182,7 @@
                 <w:sz w:val="20"/>
                 <w:szCs w:val="20"/>
               </w:rPr>
-              <w:t xml:space="preserve">—</w:t>
+              <w:t xml:space="preserve">Watchlist accepts a company name, not just a ticker ("Tesla" resolves to TSLA)</w:t>
             </w:r>
           </w:p>
         </w:tc>
@@ -204,7 +204,7 @@
                 <w:sz w:val="20"/>
                 <w:szCs w:val="20"/>
               </w:rPr>
-              <w:t xml:space="preserve"/>
+              <w:t xml:space="preserve">2026-08-04</w:t>
             </w:r>
           </w:p>
         </w:tc>
@@ -226,7 +226,7 @@
                 <w:sz w:val="20"/>
                 <w:szCs w:val="20"/>
               </w:rPr>
-              <w:t xml:space="preserve">Nothing yet — v1 is under construction.</w:t>
+              <w:t xml:space="preserve">addToWatchlist() resolves free text via the equity provider's symbol search before ever writing to the DB; rejects unmatched input instead of creating a fake instrument. Includes a cleanup tool (Admin &gt; Delete Instrument) for garbage symbols created before this existed.</w:t>
             </w:r>
           </w:p>
         </w:tc>

</xml_diff>

<commit_message>
Document sparklines/API-connections deliverable and expand enhancement backlog
Logged the 2026-08-06 feature ship (sparklines, API connections panel,
provider drill-down) in CHANGELOG.md and PROJECT_PLAN.docx. Expanded
ENHANCEMENTS.docx with 13 new backlog ideas surfaced during a full
enhancement review, split into "no new connection required" vs
"requires new external cost/integration" so they're easy to triage.

Co-Authored-By: Claude Haiku 4.5 <noreply@anthropic.com>
Claude-Session: https://claude.ai/code/session_01QtVG4mcHciQigrGtreCvPm
</commit_message>
<xml_diff>
--- a/ENHANCEMENTS.docx
+++ b/ENHANCEMENTS.docx
@@ -43,7 +43,7 @@
           <w:sz w:val="20"/>
           <w:szCs w:val="20"/>
         </w:rPr>
-        <w:t xml:space="preserve">Last updated: 2026-08-05</w:t>
+        <w:t xml:space="preserve">Last updated: 2026-08-06</w:t>
       </w:r>
     </w:p>
     <w:p>
@@ -503,6 +503,210 @@
           </w:p>
         </w:tc>
       </w:tr>
+      <w:tr>
+        <w:tc>
+          <w:tcPr>
+            <w:tcW w:type="dxa" w:w="3744"/>
+            <w:tcMar>
+              <w:top w:type="dxa" w:w="60"/>
+              <w:left w:type="dxa" w:w="100"/>
+              <w:bottom w:type="dxa" w:w="60"/>
+              <w:right w:type="dxa" w:w="100"/>
+            </w:tcMar>
+          </w:tcPr>
+          <w:p>
+            <w:r>
+              <w:rPr>
+                <w:b w:val="false"/>
+                <w:bCs w:val="false"/>
+                <w:sz w:val="20"/>
+                <w:szCs w:val="20"/>
+              </w:rPr>
+              <w:t xml:space="preserve">Price sparklines on Watchlist &amp; Screener</w:t>
+            </w:r>
+          </w:p>
+        </w:tc>
+        <w:tc>
+          <w:tcPr>
+            <w:tcW w:type="dxa" w:w="1310"/>
+            <w:tcMar>
+              <w:top w:type="dxa" w:w="60"/>
+              <w:left w:type="dxa" w:w="100"/>
+              <w:bottom w:type="dxa" w:w="60"/>
+              <w:right w:type="dxa" w:w="100"/>
+            </w:tcMar>
+          </w:tcPr>
+          <w:p>
+            <w:r>
+              <w:rPr>
+                <w:b w:val="false"/>
+                <w:bCs w:val="false"/>
+                <w:sz w:val="20"/>
+                <w:szCs w:val="20"/>
+              </w:rPr>
+              <w:t xml:space="preserve">2026-08-06</w:t>
+            </w:r>
+          </w:p>
+        </w:tc>
+        <w:tc>
+          <w:tcPr>
+            <w:tcW w:type="dxa" w:w="4306"/>
+            <w:tcMar>
+              <w:top w:type="dxa" w:w="60"/>
+              <w:left w:type="dxa" w:w="100"/>
+              <w:bottom w:type="dxa" w:w="60"/>
+              <w:right w:type="dxa" w:w="100"/>
+            </w:tcMar>
+          </w:tcPr>
+          <w:p>
+            <w:r>
+              <w:rPr>
+                <w:b w:val="false"/>
+                <w:bCs w:val="false"/>
+                <w:sz w:val="20"/>
+                <w:szCs w:val="20"/>
+              </w:rPr>
+              <w:t xml:space="preserve">30-day inline trend line per instrument (Recharts, no axes), colored green/red by direction, "—" for insufficient history. New components/sparkline.tsx; watchlist/screener actions extended to fetch 30 days instead of 2.</w:t>
+            </w:r>
+          </w:p>
+        </w:tc>
+      </w:tr>
+      <w:tr>
+        <w:tc>
+          <w:tcPr>
+            <w:tcW w:type="dxa" w:w="3744"/>
+            <w:tcMar>
+              <w:top w:type="dxa" w:w="60"/>
+              <w:left w:type="dxa" w:w="100"/>
+              <w:bottom w:type="dxa" w:w="60"/>
+              <w:right w:type="dxa" w:w="100"/>
+            </w:tcMar>
+          </w:tcPr>
+          <w:p>
+            <w:r>
+              <w:rPr>
+                <w:b w:val="false"/>
+                <w:bCs w:val="false"/>
+                <w:sz w:val="20"/>
+                <w:szCs w:val="20"/>
+              </w:rPr>
+              <w:t xml:space="preserve">Admin API Connections status panel</w:t>
+            </w:r>
+          </w:p>
+        </w:tc>
+        <w:tc>
+          <w:tcPr>
+            <w:tcW w:type="dxa" w:w="1310"/>
+            <w:tcMar>
+              <w:top w:type="dxa" w:w="60"/>
+              <w:left w:type="dxa" w:w="100"/>
+              <w:bottom w:type="dxa" w:w="60"/>
+              <w:right w:type="dxa" w:w="100"/>
+            </w:tcMar>
+          </w:tcPr>
+          <w:p>
+            <w:r>
+              <w:rPr>
+                <w:b w:val="false"/>
+                <w:bCs w:val="false"/>
+                <w:sz w:val="20"/>
+                <w:szCs w:val="20"/>
+              </w:rPr>
+              <w:t xml:space="preserve">2026-08-06</w:t>
+            </w:r>
+          </w:p>
+        </w:tc>
+        <w:tc>
+          <w:tcPr>
+            <w:tcW w:type="dxa" w:w="4306"/>
+            <w:tcMar>
+              <w:top w:type="dxa" w:w="60"/>
+              <w:left w:type="dxa" w:w="100"/>
+              <w:bottom w:type="dxa" w:w="60"/>
+              <w:right w:type="dxa" w:w="100"/>
+            </w:tcMar>
+          </w:tcPr>
+          <w:p>
+            <w:r>
+              <w:rPr>
+                <w:b w:val="false"/>
+                <w:bCs w:val="false"/>
+                <w:sz w:val="20"/>
+                <w:szCs w:val="20"/>
+              </w:rPr>
+              <w:t xml:space="preserve">New Admin Analytics card listing all 8 providers (yahoo, coingecko, fred, finnhub, alphavantage, newsapi, ibkr, anthropic) with configured/last-call/status/records-returned. getApiConnectionsStatus() in lib/audit/tracker.ts.</w:t>
+            </w:r>
+          </w:p>
+        </w:tc>
+      </w:tr>
+      <w:tr>
+        <w:tc>
+          <w:tcPr>
+            <w:tcW w:type="dxa" w:w="3744"/>
+            <w:tcMar>
+              <w:top w:type="dxa" w:w="60"/>
+              <w:left w:type="dxa" w:w="100"/>
+              <w:bottom w:type="dxa" w:w="60"/>
+              <w:right w:type="dxa" w:w="100"/>
+            </w:tcMar>
+          </w:tcPr>
+          <w:p>
+            <w:r>
+              <w:rPr>
+                <w:b w:val="false"/>
+                <w:bCs w:val="false"/>
+                <w:sz w:val="20"/>
+                <w:szCs w:val="20"/>
+              </w:rPr>
+              <w:t xml:space="preserve">Per-provider 30-day API call history drill-down</w:t>
+            </w:r>
+          </w:p>
+        </w:tc>
+        <w:tc>
+          <w:tcPr>
+            <w:tcW w:type="dxa" w:w="1310"/>
+            <w:tcMar>
+              <w:top w:type="dxa" w:w="60"/>
+              <w:left w:type="dxa" w:w="100"/>
+              <w:bottom w:type="dxa" w:w="60"/>
+              <w:right w:type="dxa" w:w="100"/>
+            </w:tcMar>
+          </w:tcPr>
+          <w:p>
+            <w:r>
+              <w:rPr>
+                <w:b w:val="false"/>
+                <w:bCs w:val="false"/>
+                <w:sz w:val="20"/>
+                <w:szCs w:val="20"/>
+              </w:rPr>
+              <w:t xml:space="preserve">2026-08-06</w:t>
+            </w:r>
+          </w:p>
+        </w:tc>
+        <w:tc>
+          <w:tcPr>
+            <w:tcW w:type="dxa" w:w="4306"/>
+            <w:tcMar>
+              <w:top w:type="dxa" w:w="60"/>
+              <w:left w:type="dxa" w:w="100"/>
+              <w:bottom w:type="dxa" w:w="60"/>
+              <w:right w:type="dxa" w:w="100"/>
+            </w:tcMar>
+          </w:tcPr>
+          <w:p>
+            <w:r>
+              <w:rPr>
+                <w:b w:val="false"/>
+                <w:bCs w:val="false"/>
+                <w:sz w:val="20"/>
+                <w:szCs w:val="20"/>
+              </w:rPr>
+              <w:t xml:space="preserve">Clicking a provider row opens /admin/analytics/connections/[provider] — full call log (timestamp, endpoint, method, status, duration, records, error). getProviderCallHistory() action; empty-state handled for never-called providers.</w:t>
+            </w:r>
+          </w:p>
+        </w:tc>
+      </w:tr>
     </w:tbl>
     <w:p>
       <w:pPr>
@@ -514,7 +718,7 @@
           <w:bCs/>
           <w:color w:val="1a1a19"/>
         </w:rPr>
-        <w:t xml:space="preserve">Not Yet Implemented</w:t>
+        <w:t xml:space="preserve">Not Yet Implemented — No New Data Connections Required</w:t>
       </w:r>
     </w:p>
     <w:tbl>
@@ -628,6 +832,1064 @@
                 <w:sz w:val="20"/>
                 <w:szCs w:val="20"/>
               </w:rPr>
+              <w:t xml:space="preserve">News page redesign (sector tabs, your-holdings section, search, sentiment badges)</w:t>
+            </w:r>
+          </w:p>
+        </w:tc>
+        <w:tc>
+          <w:tcPr>
+            <w:tcW w:type="dxa" w:w="1310"/>
+            <w:tcMar>
+              <w:top w:type="dxa" w:w="60"/>
+              <w:left w:type="dxa" w:w="100"/>
+              <w:bottom w:type="dxa" w:w="60"/>
+              <w:right w:type="dxa" w:w="100"/>
+            </w:tcMar>
+          </w:tcPr>
+          <w:p>
+            <w:r>
+              <w:rPr>
+                <w:b w:val="false"/>
+                <w:bCs w:val="false"/>
+                <w:sz w:val="20"/>
+                <w:szCs w:val="20"/>
+              </w:rPr>
+              <w:t xml:space="preserve">2026-08-06</w:t>
+            </w:r>
+          </w:p>
+        </w:tc>
+        <w:tc>
+          <w:tcPr>
+            <w:tcW w:type="dxa" w:w="4306"/>
+            <w:tcMar>
+              <w:top w:type="dxa" w:w="60"/>
+              <w:left w:type="dxa" w:w="100"/>
+              <w:bottom w:type="dxa" w:w="60"/>
+              <w:right w:type="dxa" w:w="100"/>
+            </w:tcMar>
+          </w:tcPr>
+          <w:p>
+            <w:r>
+              <w:rPr>
+                <w:b w:val="false"/>
+                <w:bCs w:val="false"/>
+                <w:sz w:val="20"/>
+                <w:szCs w:val="20"/>
+              </w:rPr>
+              <w:t xml:space="preserve">Current news page is a flat headline list with no filtering or portfolio context. Full spec drafted (scratchpad/NEWS_PAGE_REDESIGN.md): sector/asset-class tabs, time filter, "Your Holdings" + "Trending" sections, clip/dismiss, related-symbol highlighting. Uses existing RSS feeds — no new provider. Est. ~23h.</w:t>
+            </w:r>
+          </w:p>
+        </w:tc>
+      </w:tr>
+      <w:tr>
+        <w:tc>
+          <w:tcPr>
+            <w:tcW w:type="dxa" w:w="3744"/>
+            <w:tcMar>
+              <w:top w:type="dxa" w:w="60"/>
+              <w:left w:type="dxa" w:w="100"/>
+              <w:bottom w:type="dxa" w:w="60"/>
+              <w:right w:type="dxa" w:w="100"/>
+            </w:tcMar>
+          </w:tcPr>
+          <w:p>
+            <w:r>
+              <w:rPr>
+                <w:b w:val="false"/>
+                <w:bCs w:val="false"/>
+                <w:sz w:val="20"/>
+                <w:szCs w:val="20"/>
+              </w:rPr>
+              <w:t xml:space="preserve">Watchlist collections/folders</w:t>
+            </w:r>
+          </w:p>
+        </w:tc>
+        <w:tc>
+          <w:tcPr>
+            <w:tcW w:type="dxa" w:w="1310"/>
+            <w:tcMar>
+              <w:top w:type="dxa" w:w="60"/>
+              <w:left w:type="dxa" w:w="100"/>
+              <w:bottom w:type="dxa" w:w="60"/>
+              <w:right w:type="dxa" w:w="100"/>
+            </w:tcMar>
+          </w:tcPr>
+          <w:p>
+            <w:r>
+              <w:rPr>
+                <w:b w:val="false"/>
+                <w:bCs w:val="false"/>
+                <w:sz w:val="20"/>
+                <w:szCs w:val="20"/>
+              </w:rPr>
+              <w:t xml:space="preserve">2026-08-06</w:t>
+            </w:r>
+          </w:p>
+        </w:tc>
+        <w:tc>
+          <w:tcPr>
+            <w:tcW w:type="dxa" w:w="4306"/>
+            <w:tcMar>
+              <w:top w:type="dxa" w:w="60"/>
+              <w:left w:type="dxa" w:w="100"/>
+              <w:bottom w:type="dxa" w:w="60"/>
+              <w:right w:type="dxa" w:w="100"/>
+            </w:tcMar>
+          </w:tcPr>
+          <w:p>
+            <w:r>
+              <w:rPr>
+                <w:b w:val="false"/>
+                <w:bCs w:val="false"/>
+                <w:sz w:val="20"/>
+                <w:szCs w:val="20"/>
+              </w:rPr>
+              <w:t xml:space="preserve">User-defined groupings (e.g. "Tech plays", "Dividend candidates") so large watchlists stay scannable. New collections table + watchlist.collectionId FK. Est. ~6h.</w:t>
+            </w:r>
+          </w:p>
+        </w:tc>
+      </w:tr>
+      <w:tr>
+        <w:tc>
+          <w:tcPr>
+            <w:tcW w:type="dxa" w:w="3744"/>
+            <w:tcMar>
+              <w:top w:type="dxa" w:w="60"/>
+              <w:left w:type="dxa" w:w="100"/>
+              <w:bottom w:type="dxa" w:w="60"/>
+              <w:right w:type="dxa" w:w="100"/>
+            </w:tcMar>
+          </w:tcPr>
+          <w:p>
+            <w:r>
+              <w:rPr>
+                <w:b w:val="false"/>
+                <w:bCs w:val="false"/>
+                <w:sz w:val="20"/>
+                <w:szCs w:val="20"/>
+              </w:rPr>
+              <w:t xml:space="preserve">Dashboard sector composition chart</w:t>
+            </w:r>
+          </w:p>
+        </w:tc>
+        <w:tc>
+          <w:tcPr>
+            <w:tcW w:type="dxa" w:w="1310"/>
+            <w:tcMar>
+              <w:top w:type="dxa" w:w="60"/>
+              <w:left w:type="dxa" w:w="100"/>
+              <w:bottom w:type="dxa" w:w="60"/>
+              <w:right w:type="dxa" w:w="100"/>
+            </w:tcMar>
+          </w:tcPr>
+          <w:p>
+            <w:r>
+              <w:rPr>
+                <w:b w:val="false"/>
+                <w:bCs w:val="false"/>
+                <w:sz w:val="20"/>
+                <w:szCs w:val="20"/>
+              </w:rPr>
+              <w:t xml:space="preserve">2026-08-06</w:t>
+            </w:r>
+          </w:p>
+        </w:tc>
+        <w:tc>
+          <w:tcPr>
+            <w:tcW w:type="dxa" w:w="4306"/>
+            <w:tcMar>
+              <w:top w:type="dxa" w:w="60"/>
+              <w:left w:type="dxa" w:w="100"/>
+              <w:bottom w:type="dxa" w:w="60"/>
+              <w:right w:type="dxa" w:w="100"/>
+            </w:tcMar>
+          </w:tcPr>
+          <w:p>
+            <w:r>
+              <w:rPr>
+                <w:b w:val="false"/>
+                <w:bCs w:val="false"/>
+                <w:sz w:val="20"/>
+                <w:szCs w:val="20"/>
+              </w:rPr>
+              <w:t xml:space="preserve">Donut chart of watchlist by sector for an at-a-glance concentration check. Reuses existing Recharts PieChart pattern from the instrument page. Est. ~4h.</w:t>
+            </w:r>
+          </w:p>
+        </w:tc>
+      </w:tr>
+      <w:tr>
+        <w:tc>
+          <w:tcPr>
+            <w:tcW w:type="dxa" w:w="3744"/>
+            <w:tcMar>
+              <w:top w:type="dxa" w:w="60"/>
+              <w:left w:type="dxa" w:w="100"/>
+              <w:bottom w:type="dxa" w:w="60"/>
+              <w:right w:type="dxa" w:w="100"/>
+            </w:tcMar>
+          </w:tcPr>
+          <w:p>
+            <w:r>
+              <w:rPr>
+                <w:b w:val="false"/>
+                <w:bCs w:val="false"/>
+                <w:sz w:val="20"/>
+                <w:szCs w:val="20"/>
+              </w:rPr>
+              <w:t xml:space="preserve">Screener column customization</w:t>
+            </w:r>
+          </w:p>
+        </w:tc>
+        <w:tc>
+          <w:tcPr>
+            <w:tcW w:type="dxa" w:w="1310"/>
+            <w:tcMar>
+              <w:top w:type="dxa" w:w="60"/>
+              <w:left w:type="dxa" w:w="100"/>
+              <w:bottom w:type="dxa" w:w="60"/>
+              <w:right w:type="dxa" w:w="100"/>
+            </w:tcMar>
+          </w:tcPr>
+          <w:p>
+            <w:r>
+              <w:rPr>
+                <w:b w:val="false"/>
+                <w:bCs w:val="false"/>
+                <w:sz w:val="20"/>
+                <w:szCs w:val="20"/>
+              </w:rPr>
+              <w:t xml:space="preserve">2026-08-06</w:t>
+            </w:r>
+          </w:p>
+        </w:tc>
+        <w:tc>
+          <w:tcPr>
+            <w:tcW w:type="dxa" w:w="4306"/>
+            <w:tcMar>
+              <w:top w:type="dxa" w:w="60"/>
+              <w:left w:type="dxa" w:w="100"/>
+              <w:bottom w:type="dxa" w:w="60"/>
+              <w:right w:type="dxa" w:w="100"/>
+            </w:tcMar>
+          </w:tcPr>
+          <w:p>
+            <w:r>
+              <w:rPr>
+                <w:b w:val="false"/>
+                <w:bCs w:val="false"/>
+                <w:sz w:val="20"/>
+                <w:szCs w:val="20"/>
+              </w:rPr>
+              <w:t xml:space="preserve">Let the user toggle which metrics show in the screener table (P/E, FCF yield, debt/equity, etc.), saved to localStorage or a user_preferences table. Est. ~5h.</w:t>
+            </w:r>
+          </w:p>
+        </w:tc>
+      </w:tr>
+      <w:tr>
+        <w:tc>
+          <w:tcPr>
+            <w:tcW w:type="dxa" w:w="3744"/>
+            <w:tcMar>
+              <w:top w:type="dxa" w:w="60"/>
+              <w:left w:type="dxa" w:w="100"/>
+              <w:bottom w:type="dxa" w:w="60"/>
+              <w:right w:type="dxa" w:w="100"/>
+            </w:tcMar>
+          </w:tcPr>
+          <w:p>
+            <w:r>
+              <w:rPr>
+                <w:b w:val="false"/>
+                <w:bCs w:val="false"/>
+                <w:sz w:val="20"/>
+                <w:szCs w:val="20"/>
+              </w:rPr>
+              <w:t xml:space="preserve">Watchlist notes &amp; target-price UI expansion</w:t>
+            </w:r>
+          </w:p>
+        </w:tc>
+        <w:tc>
+          <w:tcPr>
+            <w:tcW w:type="dxa" w:w="1310"/>
+            <w:tcMar>
+              <w:top w:type="dxa" w:w="60"/>
+              <w:left w:type="dxa" w:w="100"/>
+              <w:bottom w:type="dxa" w:w="60"/>
+              <w:right w:type="dxa" w:w="100"/>
+            </w:tcMar>
+          </w:tcPr>
+          <w:p>
+            <w:r>
+              <w:rPr>
+                <w:b w:val="false"/>
+                <w:bCs w:val="false"/>
+                <w:sz w:val="20"/>
+                <w:szCs w:val="20"/>
+              </w:rPr>
+              <w:t xml:space="preserve">2026-08-06</w:t>
+            </w:r>
+          </w:p>
+        </w:tc>
+        <w:tc>
+          <w:tcPr>
+            <w:tcW w:type="dxa" w:w="4306"/>
+            <w:tcMar>
+              <w:top w:type="dxa" w:w="60"/>
+              <w:left w:type="dxa" w:w="100"/>
+              <w:bottom w:type="dxa" w:w="60"/>
+              <w:right w:type="dxa" w:w="100"/>
+            </w:tcMar>
+          </w:tcPr>
+          <w:p>
+            <w:r>
+              <w:rPr>
+                <w:b w:val="false"/>
+                <w:bCs w:val="false"/>
+                <w:sz w:val="20"/>
+                <w:szCs w:val="20"/>
+              </w:rPr>
+              <w:t xml:space="preserve">watchlist.note and targetPrice columns already exist in the schema but have no real editing UI. Inline editable note + target price per row. Est. ~3h.</w:t>
+            </w:r>
+          </w:p>
+        </w:tc>
+      </w:tr>
+      <w:tr>
+        <w:tc>
+          <w:tcPr>
+            <w:tcW w:type="dxa" w:w="3744"/>
+            <w:tcMar>
+              <w:top w:type="dxa" w:w="60"/>
+              <w:left w:type="dxa" w:w="100"/>
+              <w:bottom w:type="dxa" w:w="60"/>
+              <w:right w:type="dxa" w:w="100"/>
+            </w:tcMar>
+          </w:tcPr>
+          <w:p>
+            <w:r>
+              <w:rPr>
+                <w:b w:val="false"/>
+                <w:bCs w:val="false"/>
+                <w:sz w:val="20"/>
+                <w:szCs w:val="20"/>
+              </w:rPr>
+              <w:t xml:space="preserve">Dashboard refresh-status badge</w:t>
+            </w:r>
+          </w:p>
+        </w:tc>
+        <w:tc>
+          <w:tcPr>
+            <w:tcW w:type="dxa" w:w="1310"/>
+            <w:tcMar>
+              <w:top w:type="dxa" w:w="60"/>
+              <w:left w:type="dxa" w:w="100"/>
+              <w:bottom w:type="dxa" w:w="60"/>
+              <w:right w:type="dxa" w:w="100"/>
+            </w:tcMar>
+          </w:tcPr>
+          <w:p>
+            <w:r>
+              <w:rPr>
+                <w:b w:val="false"/>
+                <w:bCs w:val="false"/>
+                <w:sz w:val="20"/>
+                <w:szCs w:val="20"/>
+              </w:rPr>
+              <w:t xml:space="preserve">2026-08-06</w:t>
+            </w:r>
+          </w:p>
+        </w:tc>
+        <w:tc>
+          <w:tcPr>
+            <w:tcW w:type="dxa" w:w="4306"/>
+            <w:tcMar>
+              <w:top w:type="dxa" w:w="60"/>
+              <w:left w:type="dxa" w:w="100"/>
+              <w:bottom w:type="dxa" w:w="60"/>
+              <w:right w:type="dxa" w:w="100"/>
+            </w:tcMar>
+          </w:tcPr>
+          <w:p>
+            <w:r>
+              <w:rPr>
+                <w:b w:val="false"/>
+                <w:bCs w:val="false"/>
+                <w:sz w:val="20"/>
+                <w:szCs w:val="20"/>
+              </w:rPr>
+              <w:t xml:space="preserve">"Last updated: 2 hours ago • Next: today 8pm" badge sourced from existing refresh/cron metadata. Est. ~2h.</w:t>
+            </w:r>
+          </w:p>
+        </w:tc>
+      </w:tr>
+      <w:tr>
+        <w:tc>
+          <w:tcPr>
+            <w:tcW w:type="dxa" w:w="3744"/>
+            <w:tcMar>
+              <w:top w:type="dxa" w:w="60"/>
+              <w:left w:type="dxa" w:w="100"/>
+              <w:bottom w:type="dxa" w:w="60"/>
+              <w:right w:type="dxa" w:w="100"/>
+            </w:tcMar>
+          </w:tcPr>
+          <w:p>
+            <w:r>
+              <w:rPr>
+                <w:b w:val="false"/>
+                <w:bCs w:val="false"/>
+                <w:sz w:val="20"/>
+                <w:szCs w:val="20"/>
+              </w:rPr>
+              <w:t xml:space="preserve">Instrument detail scorecard (composite + 4 factors, above the fold)</w:t>
+            </w:r>
+          </w:p>
+        </w:tc>
+        <w:tc>
+          <w:tcPr>
+            <w:tcW w:type="dxa" w:w="1310"/>
+            <w:tcMar>
+              <w:top w:type="dxa" w:w="60"/>
+              <w:left w:type="dxa" w:w="100"/>
+              <w:bottom w:type="dxa" w:w="60"/>
+              <w:right w:type="dxa" w:w="100"/>
+            </w:tcMar>
+          </w:tcPr>
+          <w:p>
+            <w:r>
+              <w:rPr>
+                <w:b w:val="false"/>
+                <w:bCs w:val="false"/>
+                <w:sz w:val="20"/>
+                <w:szCs w:val="20"/>
+              </w:rPr>
+              <w:t xml:space="preserve">2026-08-06</w:t>
+            </w:r>
+          </w:p>
+        </w:tc>
+        <w:tc>
+          <w:tcPr>
+            <w:tcW w:type="dxa" w:w="4306"/>
+            <w:tcMar>
+              <w:top w:type="dxa" w:w="60"/>
+              <w:left w:type="dxa" w:w="100"/>
+              <w:bottom w:type="dxa" w:w="60"/>
+              <w:right w:type="dxa" w:w="100"/>
+            </w:tcMar>
+          </w:tcPr>
+          <w:p>
+            <w:r>
+              <w:rPr>
+                <w:b w:val="false"/>
+                <w:bCs w:val="false"/>
+                <w:sz w:val="20"/>
+                <w:szCs w:val="20"/>
+              </w:rPr>
+              <w:t xml:space="preserve">Fixed summary card at the top of the instrument page before the price chart, so the score is visible without scrolling. Reads existing factor_scores. Est. ~6h.</w:t>
+            </w:r>
+          </w:p>
+        </w:tc>
+      </w:tr>
+      <w:tr>
+        <w:tc>
+          <w:tcPr>
+            <w:tcW w:type="dxa" w:w="3744"/>
+            <w:tcMar>
+              <w:top w:type="dxa" w:w="60"/>
+              <w:left w:type="dxa" w:w="100"/>
+              <w:bottom w:type="dxa" w:w="60"/>
+              <w:right w:type="dxa" w:w="100"/>
+            </w:tcMar>
+          </w:tcPr>
+          <w:p>
+            <w:r>
+              <w:rPr>
+                <w:b w:val="false"/>
+                <w:bCs w:val="false"/>
+                <w:sz w:val="20"/>
+                <w:szCs w:val="20"/>
+              </w:rPr>
+              <w:t xml:space="preserve">Portfolio allocation drift trend line</w:t>
+            </w:r>
+          </w:p>
+        </w:tc>
+        <w:tc>
+          <w:tcPr>
+            <w:tcW w:type="dxa" w:w="1310"/>
+            <w:tcMar>
+              <w:top w:type="dxa" w:w="60"/>
+              <w:left w:type="dxa" w:w="100"/>
+              <w:bottom w:type="dxa" w:w="60"/>
+              <w:right w:type="dxa" w:w="100"/>
+            </w:tcMar>
+          </w:tcPr>
+          <w:p>
+            <w:r>
+              <w:rPr>
+                <w:b w:val="false"/>
+                <w:bCs w:val="false"/>
+                <w:sz w:val="20"/>
+                <w:szCs w:val="20"/>
+              </w:rPr>
+              <w:t xml:space="preserve">2026-08-06</w:t>
+            </w:r>
+          </w:p>
+        </w:tc>
+        <w:tc>
+          <w:tcPr>
+            <w:tcW w:type="dxa" w:w="4306"/>
+            <w:tcMar>
+              <w:top w:type="dxa" w:w="60"/>
+              <w:left w:type="dxa" w:w="100"/>
+              <w:bottom w:type="dxa" w:w="60"/>
+              <w:right w:type="dxa" w:w="100"/>
+            </w:tcMar>
+          </w:tcPr>
+          <w:p>
+            <w:r>
+              <w:rPr>
+                <w:b w:val="false"/>
+                <w:bCs w:val="false"/>
+                <w:sz w:val="20"/>
+                <w:szCs w:val="20"/>
+              </w:rPr>
+              <w:t xml:space="preserve">Chart showing how an account's asset-class mix has drifted from target over time, using historical holdings.asOf snapshots already being recorded. Est. ~6h.</w:t>
+            </w:r>
+          </w:p>
+        </w:tc>
+      </w:tr>
+      <w:tr>
+        <w:tc>
+          <w:tcPr>
+            <w:tcW w:type="dxa" w:w="3744"/>
+            <w:tcMar>
+              <w:top w:type="dxa" w:w="60"/>
+              <w:left w:type="dxa" w:w="100"/>
+              <w:bottom w:type="dxa" w:w="60"/>
+              <w:right w:type="dxa" w:w="100"/>
+            </w:tcMar>
+          </w:tcPr>
+          <w:p>
+            <w:r>
+              <w:rPr>
+                <w:b w:val="false"/>
+                <w:bCs w:val="false"/>
+                <w:sz w:val="20"/>
+                <w:szCs w:val="20"/>
+              </w:rPr>
+              <w:t xml:space="preserve">Settings page: theme, density, refresh schedule</w:t>
+            </w:r>
+          </w:p>
+        </w:tc>
+        <w:tc>
+          <w:tcPr>
+            <w:tcW w:type="dxa" w:w="1310"/>
+            <w:tcMar>
+              <w:top w:type="dxa" w:w="60"/>
+              <w:left w:type="dxa" w:w="100"/>
+              <w:bottom w:type="dxa" w:w="60"/>
+              <w:right w:type="dxa" w:w="100"/>
+            </w:tcMar>
+          </w:tcPr>
+          <w:p>
+            <w:r>
+              <w:rPr>
+                <w:b w:val="false"/>
+                <w:bCs w:val="false"/>
+                <w:sz w:val="20"/>
+                <w:szCs w:val="20"/>
+              </w:rPr>
+              <w:t xml:space="preserve">2026-08-06</w:t>
+            </w:r>
+          </w:p>
+        </w:tc>
+        <w:tc>
+          <w:tcPr>
+            <w:tcW w:type="dxa" w:w="4306"/>
+            <w:tcMar>
+              <w:top w:type="dxa" w:w="60"/>
+              <w:left w:type="dxa" w:w="100"/>
+              <w:bottom w:type="dxa" w:w="60"/>
+              <w:right w:type="dxa" w:w="100"/>
+            </w:tcMar>
+          </w:tcPr>
+          <w:p>
+            <w:r>
+              <w:rPr>
+                <w:b w:val="false"/>
+                <w:bCs w:val="false"/>
+                <w:sz w:val="20"/>
+                <w:szCs w:val="20"/>
+              </w:rPr>
+              <w:t xml:space="preserve">Light/dark/auto theme, compact/normal/spacious table density, basic refresh-cadence config — all client-side or existing-DB, no new integration. Est. ~5h.</w:t>
+            </w:r>
+          </w:p>
+        </w:tc>
+      </w:tr>
+      <w:tr>
+        <w:tc>
+          <w:tcPr>
+            <w:tcW w:type="dxa" w:w="3744"/>
+            <w:tcMar>
+              <w:top w:type="dxa" w:w="60"/>
+              <w:left w:type="dxa" w:w="100"/>
+              <w:bottom w:type="dxa" w:w="60"/>
+              <w:right w:type="dxa" w:w="100"/>
+            </w:tcMar>
+          </w:tcPr>
+          <w:p>
+            <w:r>
+              <w:rPr>
+                <w:b w:val="false"/>
+                <w:bCs w:val="false"/>
+                <w:sz w:val="20"/>
+                <w:szCs w:val="20"/>
+              </w:rPr>
+              <w:t xml:space="preserve">CSV export &amp; shareable filtered links</w:t>
+            </w:r>
+          </w:p>
+        </w:tc>
+        <w:tc>
+          <w:tcPr>
+            <w:tcW w:type="dxa" w:w="1310"/>
+            <w:tcMar>
+              <w:top w:type="dxa" w:w="60"/>
+              <w:left w:type="dxa" w:w="100"/>
+              <w:bottom w:type="dxa" w:w="60"/>
+              <w:right w:type="dxa" w:w="100"/>
+            </w:tcMar>
+          </w:tcPr>
+          <w:p>
+            <w:r>
+              <w:rPr>
+                <w:b w:val="false"/>
+                <w:bCs w:val="false"/>
+                <w:sz w:val="20"/>
+                <w:szCs w:val="20"/>
+              </w:rPr>
+              <w:t xml:space="preserve">2026-08-06</w:t>
+            </w:r>
+          </w:p>
+        </w:tc>
+        <w:tc>
+          <w:tcPr>
+            <w:tcW w:type="dxa" w:w="4306"/>
+            <w:tcMar>
+              <w:top w:type="dxa" w:w="60"/>
+              <w:left w:type="dxa" w:w="100"/>
+              <w:bottom w:type="dxa" w:w="60"/>
+              <w:right w:type="dxa" w:w="100"/>
+            </w:tcMar>
+          </w:tcPr>
+          <w:p>
+            <w:r>
+              <w:rPr>
+                <w:b w:val="false"/>
+                <w:bCs w:val="false"/>
+                <w:sz w:val="20"/>
+                <w:szCs w:val="20"/>
+              </w:rPr>
+              <w:t xml:space="preserve">Export watchlist/screener to CSV; encode screener filters in the URL so a filtered view can be shared/bookmarked. Est. ~7h.</w:t>
+            </w:r>
+          </w:p>
+        </w:tc>
+      </w:tr>
+      <w:tr>
+        <w:tc>
+          <w:tcPr>
+            <w:tcW w:type="dxa" w:w="3744"/>
+            <w:tcMar>
+              <w:top w:type="dxa" w:w="60"/>
+              <w:left w:type="dxa" w:w="100"/>
+              <w:bottom w:type="dxa" w:w="60"/>
+              <w:right w:type="dxa" w:w="100"/>
+            </w:tcMar>
+          </w:tcPr>
+          <w:p>
+            <w:r>
+              <w:rPr>
+                <w:b w:val="false"/>
+                <w:bCs w:val="false"/>
+                <w:sz w:val="20"/>
+                <w:szCs w:val="20"/>
+              </w:rPr>
+              <w:t xml:space="preserve">Backtesting engine over persisted factor-score history</w:t>
+            </w:r>
+          </w:p>
+        </w:tc>
+        <w:tc>
+          <w:tcPr>
+            <w:tcW w:type="dxa" w:w="1310"/>
+            <w:tcMar>
+              <w:top w:type="dxa" w:w="60"/>
+              <w:left w:type="dxa" w:w="100"/>
+              <w:bottom w:type="dxa" w:w="60"/>
+              <w:right w:type="dxa" w:w="100"/>
+            </w:tcMar>
+          </w:tcPr>
+          <w:p>
+            <w:r>
+              <w:rPr>
+                <w:b w:val="false"/>
+                <w:bCs w:val="false"/>
+                <w:sz w:val="20"/>
+                <w:szCs w:val="20"/>
+              </w:rPr>
+              <w:t xml:space="preserve">2026-08-03</w:t>
+            </w:r>
+          </w:p>
+        </w:tc>
+        <w:tc>
+          <w:tcPr>
+            <w:tcW w:type="dxa" w:w="4306"/>
+            <w:tcMar>
+              <w:top w:type="dxa" w:w="60"/>
+              <w:left w:type="dxa" w:w="100"/>
+              <w:bottom w:type="dxa" w:w="60"/>
+              <w:right w:type="dxa" w:w="100"/>
+            </w:tcMar>
+          </w:tcPr>
+          <w:p>
+            <w:r>
+              <w:rPr>
+                <w:b w:val="false"/>
+                <w:bCs w:val="false"/>
+                <w:sz w:val="20"/>
+                <w:szCs w:val="20"/>
+              </w:rPr>
+              <w:t xml:space="preserve">factor_scores table is designed to enable this; consider DuckDB for the analytics if data grows. Factor scores now actually persist (fixed 2026-08-05), so there's real history to backtest against going forward. Simple version ("buy top-5 scorers weekly, track P&amp;L vs SPY") est. ~15h.</w:t>
+            </w:r>
+          </w:p>
+        </w:tc>
+      </w:tr>
+      <w:tr>
+        <w:tc>
+          <w:tcPr>
+            <w:tcW w:type="dxa" w:w="3744"/>
+            <w:tcMar>
+              <w:top w:type="dxa" w:w="60"/>
+              <w:left w:type="dxa" w:w="100"/>
+              <w:bottom w:type="dxa" w:w="60"/>
+              <w:right w:type="dxa" w:w="100"/>
+            </w:tcMar>
+          </w:tcPr>
+          <w:p>
+            <w:r>
+              <w:rPr>
+                <w:b w:val="false"/>
+                <w:bCs w:val="false"/>
+                <w:sz w:val="20"/>
+                <w:szCs w:val="20"/>
+              </w:rPr>
+              <w:t xml:space="preserve">Mobile responsiveness audit &amp; polish</w:t>
+            </w:r>
+          </w:p>
+        </w:tc>
+        <w:tc>
+          <w:tcPr>
+            <w:tcW w:type="dxa" w:w="1310"/>
+            <w:tcMar>
+              <w:top w:type="dxa" w:w="60"/>
+              <w:left w:type="dxa" w:w="100"/>
+              <w:bottom w:type="dxa" w:w="60"/>
+              <w:right w:type="dxa" w:w="100"/>
+            </w:tcMar>
+          </w:tcPr>
+          <w:p>
+            <w:r>
+              <w:rPr>
+                <w:b w:val="false"/>
+                <w:bCs w:val="false"/>
+                <w:sz w:val="20"/>
+                <w:szCs w:val="20"/>
+              </w:rPr>
+              <w:t xml:space="preserve">2026-08-06</w:t>
+            </w:r>
+          </w:p>
+        </w:tc>
+        <w:tc>
+          <w:tcPr>
+            <w:tcW w:type="dxa" w:w="4306"/>
+            <w:tcMar>
+              <w:top w:type="dxa" w:w="60"/>
+              <w:left w:type="dxa" w:w="100"/>
+              <w:bottom w:type="dxa" w:w="60"/>
+              <w:right w:type="dxa" w:w="100"/>
+            </w:tcMar>
+          </w:tcPr>
+          <w:p>
+            <w:r>
+              <w:rPr>
+                <w:b w:val="false"/>
+                <w:bCs w:val="false"/>
+                <w:sz w:val="20"/>
+                <w:szCs w:val="20"/>
+              </w:rPr>
+              <w:t xml:space="preserve">Responsive table stacking, 44px touch targets, hamburger nav below 1024px. No data dependency. Est. ~10h.</w:t>
+            </w:r>
+          </w:p>
+        </w:tc>
+      </w:tr>
+      <w:tr>
+        <w:tc>
+          <w:tcPr>
+            <w:tcW w:type="dxa" w:w="3744"/>
+            <w:tcMar>
+              <w:top w:type="dxa" w:w="60"/>
+              <w:left w:type="dxa" w:w="100"/>
+              <w:bottom w:type="dxa" w:w="60"/>
+              <w:right w:type="dxa" w:w="100"/>
+            </w:tcMar>
+          </w:tcPr>
+          <w:p>
+            <w:r>
+              <w:rPr>
+                <w:b w:val="false"/>
+                <w:bCs w:val="false"/>
+                <w:sz w:val="20"/>
+                <w:szCs w:val="20"/>
+              </w:rPr>
+              <w:t xml:space="preserve">WCAG 2.1 AA accessibility audit</w:t>
+            </w:r>
+          </w:p>
+        </w:tc>
+        <w:tc>
+          <w:tcPr>
+            <w:tcW w:type="dxa" w:w="1310"/>
+            <w:tcMar>
+              <w:top w:type="dxa" w:w="60"/>
+              <w:left w:type="dxa" w:w="100"/>
+              <w:bottom w:type="dxa" w:w="60"/>
+              <w:right w:type="dxa" w:w="100"/>
+            </w:tcMar>
+          </w:tcPr>
+          <w:p>
+            <w:r>
+              <w:rPr>
+                <w:b w:val="false"/>
+                <w:bCs w:val="false"/>
+                <w:sz w:val="20"/>
+                <w:szCs w:val="20"/>
+              </w:rPr>
+              <w:t xml:space="preserve">2026-08-06</w:t>
+            </w:r>
+          </w:p>
+        </w:tc>
+        <w:tc>
+          <w:tcPr>
+            <w:tcW w:type="dxa" w:w="4306"/>
+            <w:tcMar>
+              <w:top w:type="dxa" w:w="60"/>
+              <w:left w:type="dxa" w:w="100"/>
+              <w:bottom w:type="dxa" w:w="60"/>
+              <w:right w:type="dxa" w:w="100"/>
+            </w:tcMar>
+          </w:tcPr>
+          <w:p>
+            <w:r>
+              <w:rPr>
+                <w:b w:val="false"/>
+                <w:bCs w:val="false"/>
+                <w:sz w:val="20"/>
+                <w:szCs w:val="20"/>
+              </w:rPr>
+              <w:t xml:space="preserve">Run axe/WAVE across all pages, fix contrast, add ARIA labels, verify full keyboard navigation. Est. ~10h.</w:t>
+            </w:r>
+          </w:p>
+        </w:tc>
+      </w:tr>
+      <w:tr>
+        <w:tc>
+          <w:tcPr>
+            <w:tcW w:type="dxa" w:w="3744"/>
+            <w:tcMar>
+              <w:top w:type="dxa" w:w="60"/>
+              <w:left w:type="dxa" w:w="100"/>
+              <w:bottom w:type="dxa" w:w="60"/>
+              <w:right w:type="dxa" w:w="100"/>
+            </w:tcMar>
+          </w:tcPr>
+          <w:p>
+            <w:r>
+              <w:rPr>
+                <w:b w:val="false"/>
+                <w:bCs w:val="false"/>
+                <w:sz w:val="20"/>
+                <w:szCs w:val="20"/>
+              </w:rPr>
+              <w:t xml:space="preserve">Market indices/crypto data on the Markets &amp; Dashboard pages (SPY/QQQ/IWM/BTC/ETH/USDT)</w:t>
+            </w:r>
+          </w:p>
+        </w:tc>
+        <w:tc>
+          <w:tcPr>
+            <w:tcW w:type="dxa" w:w="1310"/>
+            <w:tcMar>
+              <w:top w:type="dxa" w:w="60"/>
+              <w:left w:type="dxa" w:w="100"/>
+              <w:bottom w:type="dxa" w:w="60"/>
+              <w:right w:type="dxa" w:w="100"/>
+            </w:tcMar>
+          </w:tcPr>
+          <w:p>
+            <w:r>
+              <w:rPr>
+                <w:b w:val="false"/>
+                <w:bCs w:val="false"/>
+                <w:sz w:val="20"/>
+                <w:szCs w:val="20"/>
+              </w:rPr>
+              <w:t xml:space="preserve">2026-08-05</w:t>
+            </w:r>
+          </w:p>
+        </w:tc>
+        <w:tc>
+          <w:tcPr>
+            <w:tcW w:type="dxa" w:w="4306"/>
+            <w:tcMar>
+              <w:top w:type="dxa" w:w="60"/>
+              <w:left w:type="dxa" w:w="100"/>
+              <w:bottom w:type="dxa" w:w="60"/>
+              <w:right w:type="dxa" w:w="100"/>
+            </w:tcMar>
+          </w:tcPr>
+          <w:p>
+            <w:r>
+              <w:rPr>
+                <w:b w:val="false"/>
+                <w:bCs w:val="false"/>
+                <w:sz w:val="20"/>
+                <w:szCs w:val="20"/>
+              </w:rPr>
+              <w:t xml:space="preserve">Pipeline now persists prices for whatever's on the watchlist, but these specific index/crypto instruments are never seeded, so the cards stay correctly empty. Needs a seed step (Admin action) to populate them.</w:t>
+            </w:r>
+          </w:p>
+        </w:tc>
+      </w:tr>
+    </w:tbl>
+    <w:p>
+      <w:pPr>
+        <w:pStyle w:val="Heading1"/>
+      </w:pPr>
+      <w:r>
+        <w:rPr>
+          <w:b/>
+          <w:bCs/>
+          <w:color w:val="1a1a19"/>
+        </w:rPr>
+        <w:t xml:space="preserve">Not Yet Implemented — Requires New External Connection/Cost</w:t>
+      </w:r>
+    </w:p>
+    <w:tbl>
+      <w:tblPr>
+        <w:tblW w:type="dxa" w:w="9360"/>
+        <w:tblBorders>
+          <w:top w:val="single" w:color="c3c2b7" w:sz="4"/>
+          <w:left w:val="single" w:color="c3c2b7" w:sz="4"/>
+          <w:bottom w:val="single" w:color="c3c2b7" w:sz="4"/>
+          <w:right w:val="single" w:color="c3c2b7" w:sz="4"/>
+          <w:insideH w:val="single" w:color="c3c2b7" w:sz="4"/>
+          <w:insideV w:val="single" w:color="c3c2b7" w:sz="4"/>
+        </w:tblBorders>
+        <w:tblLayout w:type="fixed"/>
+      </w:tblPr>
+      <w:tblGrid>
+        <w:gridCol w:w="3744"/>
+        <w:gridCol w:w="1310"/>
+        <w:gridCol w:w="4306"/>
+      </w:tblGrid>
+      <w:tr>
+        <w:trPr>
+          <w:tblHeader/>
+        </w:trPr>
+        <w:tc>
+          <w:tcPr>
+            <w:tcW w:type="dxa" w:w="3744"/>
+            <w:shd w:fill="f0efec" w:val="clear"/>
+            <w:tcMar>
+              <w:top w:type="dxa" w:w="60"/>
+              <w:left w:type="dxa" w:w="100"/>
+              <w:bottom w:type="dxa" w:w="60"/>
+              <w:right w:type="dxa" w:w="100"/>
+            </w:tcMar>
+          </w:tcPr>
+          <w:p>
+            <w:r>
+              <w:rPr>
+                <w:b/>
+                <w:bCs/>
+                <w:sz w:val="20"/>
+                <w:szCs w:val="20"/>
+              </w:rPr>
+              <w:t xml:space="preserve">Idea</w:t>
+            </w:r>
+          </w:p>
+        </w:tc>
+        <w:tc>
+          <w:tcPr>
+            <w:tcW w:type="dxa" w:w="1310"/>
+            <w:shd w:fill="f0efec" w:val="clear"/>
+            <w:tcMar>
+              <w:top w:type="dxa" w:w="60"/>
+              <w:left w:type="dxa" w:w="100"/>
+              <w:bottom w:type="dxa" w:w="60"/>
+              <w:right w:type="dxa" w:w="100"/>
+            </w:tcMar>
+          </w:tcPr>
+          <w:p>
+            <w:r>
+              <w:rPr>
+                <w:b/>
+                <w:bCs/>
+                <w:sz w:val="20"/>
+                <w:szCs w:val="20"/>
+              </w:rPr>
+              <w:t xml:space="preserve">Raised</w:t>
+            </w:r>
+          </w:p>
+        </w:tc>
+        <w:tc>
+          <w:tcPr>
+            <w:tcW w:type="dxa" w:w="4306"/>
+            <w:shd w:fill="f0efec" w:val="clear"/>
+            <w:tcMar>
+              <w:top w:type="dxa" w:w="60"/>
+              <w:left w:type="dxa" w:w="100"/>
+              <w:bottom w:type="dxa" w:w="60"/>
+              <w:right w:type="dxa" w:w="100"/>
+            </w:tcMar>
+          </w:tcPr>
+          <w:p>
+            <w:r>
+              <w:rPr>
+                <w:b/>
+                <w:bCs/>
+                <w:sz w:val="20"/>
+                <w:szCs w:val="20"/>
+              </w:rPr>
+              <w:t xml:space="preserve">Notes</w:t>
+            </w:r>
+          </w:p>
+        </w:tc>
+      </w:tr>
+      <w:tr>
+        <w:tc>
+          <w:tcPr>
+            <w:tcW w:type="dxa" w:w="3744"/>
+            <w:tcMar>
+              <w:top w:type="dxa" w:w="60"/>
+              <w:left w:type="dxa" w:w="100"/>
+              <w:bottom w:type="dxa" w:w="60"/>
+              <w:right w:type="dxa" w:w="100"/>
+            </w:tcMar>
+          </w:tcPr>
+          <w:p>
+            <w:r>
+              <w:rPr>
+                <w:b w:val="false"/>
+                <w:bCs w:val="false"/>
+                <w:sz w:val="20"/>
+                <w:szCs w:val="20"/>
+              </w:rPr>
               <w:t xml:space="preserve">Aggregator sync for account holdings (Plaid / SnapTrade)</w:t>
             </w:r>
           </w:p>
@@ -764,7 +2026,7 @@
                 <w:sz w:val="20"/>
                 <w:szCs w:val="20"/>
               </w:rPr>
-              <w:t xml:space="preserve">Backtesting engine over persisted factor-score history</w:t>
+              <w:t xml:space="preserve">Individual bond data (CUSIP-level)</w:t>
             </w:r>
           </w:p>
         </w:tc>
@@ -808,31 +2070,31 @@
                 <w:sz w:val="20"/>
                 <w:szCs w:val="20"/>
               </w:rPr>
-              <w:t xml:space="preserve">factor_scores table is designed to enable this; consider DuckDB for the analytics if data grows. Factor scores now actually persist (fixed 2026-08-05), so there's real history to backtest against going forward.</w:t>
-            </w:r>
-          </w:p>
-        </w:tc>
-      </w:tr>
-      <w:tr>
-        <w:tc>
-          <w:tcPr>
-            <w:tcW w:type="dxa" w:w="3744"/>
-            <w:tcMar>
-              <w:top w:type="dxa" w:w="60"/>
-              <w:left w:type="dxa" w:w="100"/>
-              <w:bottom w:type="dxa" w:w="60"/>
-              <w:right w:type="dxa" w:w="100"/>
-            </w:tcMar>
-          </w:tcPr>
-          <w:p>
-            <w:r>
-              <w:rPr>
-                <w:b w:val="false"/>
-                <w:bCs w:val="false"/>
-                <w:sz w:val="20"/>
-                <w:szCs w:val="20"/>
-              </w:rPr>
-              <w:t xml:space="preserve">Individual bond data (CUSIP-level)</w:t>
+              <w:t xml:space="preserve">Deferred — requires premium data; v1 uses yield curve + bond-ETF proxies.</w:t>
+            </w:r>
+          </w:p>
+        </w:tc>
+      </w:tr>
+      <w:tr>
+        <w:tc>
+          <w:tcPr>
+            <w:tcW w:type="dxa" w:w="3744"/>
+            <w:tcMar>
+              <w:top w:type="dxa" w:w="60"/>
+              <w:left w:type="dxa" w:w="100"/>
+              <w:bottom w:type="dxa" w:w="60"/>
+              <w:right w:type="dxa" w:w="100"/>
+            </w:tcMar>
+          </w:tcPr>
+          <w:p>
+            <w:r>
+              <w:rPr>
+                <w:b w:val="false"/>
+                <w:bCs w:val="false"/>
+                <w:sz w:val="20"/>
+                <w:szCs w:val="20"/>
+              </w:rPr>
+              <w:t xml:space="preserve">Real-time quotes</w:t>
             </w:r>
           </w:p>
         </w:tc>
@@ -876,31 +2138,31 @@
                 <w:sz w:val="20"/>
                 <w:szCs w:val="20"/>
               </w:rPr>
-              <w:t xml:space="preserve">Deferred — requires premium data; v1 uses yield curve + bond-ETF proxies.</w:t>
-            </w:r>
-          </w:p>
-        </w:tc>
-      </w:tr>
-      <w:tr>
-        <w:tc>
-          <w:tcPr>
-            <w:tcW w:type="dxa" w:w="3744"/>
-            <w:tcMar>
-              <w:top w:type="dxa" w:w="60"/>
-              <w:left w:type="dxa" w:w="100"/>
-              <w:bottom w:type="dxa" w:w="60"/>
-              <w:right w:type="dxa" w:w="100"/>
-            </w:tcMar>
-          </w:tcPr>
-          <w:p>
-            <w:r>
-              <w:rPr>
-                <w:b w:val="false"/>
-                <w:bCs w:val="false"/>
-                <w:sz w:val="20"/>
-                <w:szCs w:val="20"/>
-              </w:rPr>
-              <w:t xml:space="preserve">Real-time quotes</w:t>
+              <w:t xml:space="preserve">Requires paid provider; free tier is delayed/EOD.</w:t>
+            </w:r>
+          </w:p>
+        </w:tc>
+      </w:tr>
+      <w:tr>
+        <w:tc>
+          <w:tcPr>
+            <w:tcW w:type="dxa" w:w="3744"/>
+            <w:tcMar>
+              <w:top w:type="dxa" w:w="60"/>
+              <w:left w:type="dxa" w:w="100"/>
+              <w:bottom w:type="dxa" w:w="60"/>
+              <w:right w:type="dxa" w:w="100"/>
+            </w:tcMar>
+          </w:tcPr>
+          <w:p>
+            <w:r>
+              <w:rPr>
+                <w:b w:val="false"/>
+                <w:bCs w:val="false"/>
+                <w:sz w:val="20"/>
+                <w:szCs w:val="20"/>
+              </w:rPr>
+              <w:t xml:space="preserve">Portfolio tracking (positions, cost basis, P&amp;L)</w:t>
             </w:r>
           </w:p>
         </w:tc>
@@ -944,143 +2206,143 @@
                 <w:sz w:val="20"/>
                 <w:szCs w:val="20"/>
               </w:rPr>
-              <w:t xml:space="preserve">Requires paid provider; free tier is delayed/EOD.</w:t>
-            </w:r>
-          </w:p>
-        </w:tc>
-      </w:tr>
-      <w:tr>
-        <w:tc>
-          <w:tcPr>
-            <w:tcW w:type="dxa" w:w="3744"/>
-            <w:tcMar>
-              <w:top w:type="dxa" w:w="60"/>
-              <w:left w:type="dxa" w:w="100"/>
-              <w:bottom w:type="dxa" w:w="60"/>
-              <w:right w:type="dxa" w:w="100"/>
-            </w:tcMar>
-          </w:tcPr>
-          <w:p>
-            <w:r>
-              <w:rPr>
-                <w:b w:val="false"/>
-                <w:bCs w:val="false"/>
-                <w:sz w:val="20"/>
-                <w:szCs w:val="20"/>
-              </w:rPr>
-              <w:t xml:space="preserve">Portfolio tracking (positions, cost basis, P&amp;L)</w:t>
-            </w:r>
-          </w:p>
-        </w:tc>
-        <w:tc>
-          <w:tcPr>
-            <w:tcW w:type="dxa" w:w="1310"/>
-            <w:tcMar>
-              <w:top w:type="dxa" w:w="60"/>
-              <w:left w:type="dxa" w:w="100"/>
-              <w:bottom w:type="dxa" w:w="60"/>
-              <w:right w:type="dxa" w:w="100"/>
-            </w:tcMar>
-          </w:tcPr>
-          <w:p>
-            <w:r>
-              <w:rPr>
-                <w:b w:val="false"/>
-                <w:bCs w:val="false"/>
-                <w:sz w:val="20"/>
-                <w:szCs w:val="20"/>
-              </w:rPr>
-              <w:t xml:space="preserve">2026-08-03</w:t>
-            </w:r>
-          </w:p>
-        </w:tc>
-        <w:tc>
-          <w:tcPr>
-            <w:tcW w:type="dxa" w:w="4306"/>
-            <w:tcMar>
-              <w:top w:type="dxa" w:w="60"/>
-              <w:left w:type="dxa" w:w="100"/>
-              <w:bottom w:type="dxa" w:w="60"/>
-              <w:right w:type="dxa" w:w="100"/>
-            </w:tcMar>
-          </w:tcPr>
-          <w:p>
-            <w:r>
-              <w:rPr>
-                <w:b w:val="false"/>
-                <w:bCs w:val="false"/>
-                <w:sz w:val="20"/>
-                <w:szCs w:val="20"/>
-              </w:rPr>
-              <w:t xml:space="preserve">Out of v1 scope — dashboard is research-first; natural v2 candidate.</w:t>
-            </w:r>
-          </w:p>
-        </w:tc>
-      </w:tr>
-      <w:tr>
-        <w:tc>
-          <w:tcPr>
-            <w:tcW w:type="dxa" w:w="3744"/>
-            <w:tcMar>
-              <w:top w:type="dxa" w:w="60"/>
-              <w:left w:type="dxa" w:w="100"/>
-              <w:bottom w:type="dxa" w:w="60"/>
-              <w:right w:type="dxa" w:w="100"/>
-            </w:tcMar>
-          </w:tcPr>
-          <w:p>
-            <w:r>
-              <w:rPr>
-                <w:b w:val="false"/>
-                <w:bCs w:val="false"/>
-                <w:sz w:val="20"/>
-                <w:szCs w:val="20"/>
-              </w:rPr>
-              <w:t xml:space="preserve">Market indices/crypto data on the Markets &amp; Dashboard pages (SPY/QQQ/IWM/BTC/ETH/USDT)</w:t>
-            </w:r>
-          </w:p>
-        </w:tc>
-        <w:tc>
-          <w:tcPr>
-            <w:tcW w:type="dxa" w:w="1310"/>
-            <w:tcMar>
-              <w:top w:type="dxa" w:w="60"/>
-              <w:left w:type="dxa" w:w="100"/>
-              <w:bottom w:type="dxa" w:w="60"/>
-              <w:right w:type="dxa" w:w="100"/>
-            </w:tcMar>
-          </w:tcPr>
-          <w:p>
-            <w:r>
-              <w:rPr>
-                <w:b w:val="false"/>
-                <w:bCs w:val="false"/>
-                <w:sz w:val="20"/>
-                <w:szCs w:val="20"/>
-              </w:rPr>
-              <w:t xml:space="preserve">2026-08-05</w:t>
-            </w:r>
-          </w:p>
-        </w:tc>
-        <w:tc>
-          <w:tcPr>
-            <w:tcW w:type="dxa" w:w="4306"/>
-            <w:tcMar>
-              <w:top w:type="dxa" w:w="60"/>
-              <w:left w:type="dxa" w:w="100"/>
-              <w:bottom w:type="dxa" w:w="60"/>
-              <w:right w:type="dxa" w:w="100"/>
-            </w:tcMar>
-          </w:tcPr>
-          <w:p>
-            <w:r>
-              <w:rPr>
-                <w:b w:val="false"/>
-                <w:bCs w:val="false"/>
-                <w:sz w:val="20"/>
-                <w:szCs w:val="20"/>
-              </w:rPr>
-              <w:t xml:space="preserve">Pipeline now persists prices for whatever's on the watchlist, but these specific index/crypto instruments are never seeded, so the cards stay correctly empty. Needs a seed step (Admin action) to populate them.</w:t>
+              <w:t xml:space="preserve">Out of v1 scope — dashboard is research-first; natural v2 candidate. Cost-basis tracking needs an imported-transactions source.</w:t>
+            </w:r>
+          </w:p>
+        </w:tc>
+      </w:tr>
+      <w:tr>
+        <w:tc>
+          <w:tcPr>
+            <w:tcW w:type="dxa" w:w="3744"/>
+            <w:tcMar>
+              <w:top w:type="dxa" w:w="60"/>
+              <w:left w:type="dxa" w:w="100"/>
+              <w:bottom w:type="dxa" w:w="60"/>
+              <w:right w:type="dxa" w:w="100"/>
+            </w:tcMar>
+          </w:tcPr>
+          <w:p>
+            <w:r>
+              <w:rPr>
+                <w:b w:val="false"/>
+                <w:bCs w:val="false"/>
+                <w:sz w:val="20"/>
+                <w:szCs w:val="20"/>
+              </w:rPr>
+              <w:t xml:space="preserve">Daily email digest</w:t>
+            </w:r>
+          </w:p>
+        </w:tc>
+        <w:tc>
+          <w:tcPr>
+            <w:tcW w:type="dxa" w:w="1310"/>
+            <w:tcMar>
+              <w:top w:type="dxa" w:w="60"/>
+              <w:left w:type="dxa" w:w="100"/>
+              <w:bottom w:type="dxa" w:w="60"/>
+              <w:right w:type="dxa" w:w="100"/>
+            </w:tcMar>
+          </w:tcPr>
+          <w:p>
+            <w:r>
+              <w:rPr>
+                <w:b w:val="false"/>
+                <w:bCs w:val="false"/>
+                <w:sz w:val="20"/>
+                <w:szCs w:val="20"/>
+              </w:rPr>
+              <w:t xml:space="preserve">2026-08-06</w:t>
+            </w:r>
+          </w:p>
+        </w:tc>
+        <w:tc>
+          <w:tcPr>
+            <w:tcW w:type="dxa" w:w="4306"/>
+            <w:tcMar>
+              <w:top w:type="dxa" w:w="60"/>
+              <w:left w:type="dxa" w:w="100"/>
+              <w:bottom w:type="dxa" w:w="60"/>
+              <w:right w:type="dxa" w:w="100"/>
+            </w:tcMar>
+          </w:tcPr>
+          <w:p>
+            <w:r>
+              <w:rPr>
+                <w:b w:val="false"/>
+                <w:bCs w:val="false"/>
+                <w:sz w:val="20"/>
+                <w:szCs w:val="20"/>
+              </w:rPr>
+              <w:t xml:space="preserve">"Top 3 headlines + portfolio changes" opt-in email. Requires SMTP/email-provider integration (e.g. Resend, SES).</w:t>
+            </w:r>
+          </w:p>
+        </w:tc>
+      </w:tr>
+      <w:tr>
+        <w:tc>
+          <w:tcPr>
+            <w:tcW w:type="dxa" w:w="3744"/>
+            <w:tcMar>
+              <w:top w:type="dxa" w:w="60"/>
+              <w:left w:type="dxa" w:w="100"/>
+              <w:bottom w:type="dxa" w:w="60"/>
+              <w:right w:type="dxa" w:w="100"/>
+            </w:tcMar>
+          </w:tcPr>
+          <w:p>
+            <w:r>
+              <w:rPr>
+                <w:b w:val="false"/>
+                <w:bCs w:val="false"/>
+                <w:sz w:val="20"/>
+                <w:szCs w:val="20"/>
+              </w:rPr>
+              <w:t xml:space="preserve">Sentiment-scoring API for news</w:t>
+            </w:r>
+          </w:p>
+        </w:tc>
+        <w:tc>
+          <w:tcPr>
+            <w:tcW w:type="dxa" w:w="1310"/>
+            <w:tcMar>
+              <w:top w:type="dxa" w:w="60"/>
+              <w:left w:type="dxa" w:w="100"/>
+              <w:bottom w:type="dxa" w:w="60"/>
+              <w:right w:type="dxa" w:w="100"/>
+            </w:tcMar>
+          </w:tcPr>
+          <w:p>
+            <w:r>
+              <w:rPr>
+                <w:b w:val="false"/>
+                <w:bCs w:val="false"/>
+                <w:sz w:val="20"/>
+                <w:szCs w:val="20"/>
+              </w:rPr>
+              <w:t xml:space="preserve">2026-08-06</w:t>
+            </w:r>
+          </w:p>
+        </w:tc>
+        <w:tc>
+          <w:tcPr>
+            <w:tcW w:type="dxa" w:w="4306"/>
+            <w:tcMar>
+              <w:top w:type="dxa" w:w="60"/>
+              <w:left w:type="dxa" w:w="100"/>
+              <w:bottom w:type="dxa" w:w="60"/>
+              <w:right w:type="dxa" w:w="100"/>
+            </w:tcMar>
+          </w:tcPr>
+          <w:p>
+            <w:r>
+              <w:rPr>
+                <w:b w:val="false"/>
+                <w:bCs w:val="false"/>
+                <w:sz w:val="20"/>
+                <w:szCs w:val="20"/>
+              </w:rPr>
+              <w:t xml:space="preserve">Heuristic sentiment badges can ship with no new connection; a materially more accurate sentiment model would require a paid NLP/sentiment API.</w:t>
             </w:r>
           </w:p>
         </w:tc>

</xml_diff>